<commit_message>
2nd version of data mapping
</commit_message>
<xml_diff>
--- a/Data Mapping Draft.docx
+++ b/Data Mapping Draft.docx
@@ -43,7 +43,7 @@
     <w:p>
       <w:pPr>
         <w:rPr>
-          <w:rFonts w:ascii="Cambria" w:hAnsi="Cambria"/>
+          <w:rFonts w:ascii="Cambria" w:hAnsi="Cambria" w:hint="eastAsia"/>
         </w:rPr>
       </w:pPr>
       <w:r>
@@ -62,7 +62,25 @@
         <w:rPr>
           <w:rFonts w:ascii="Cambria" w:hAnsi="Cambria"/>
         </w:rPr>
-        <w:t>comprising records for 39,685 patients and 64,354 surgeries.</w:t>
+        <w:t>comprising records for 39,685 patients and 64,354 surgeries</w:t>
+      </w:r>
+      <w:r>
+        <w:rPr>
+          <w:rFonts w:ascii="Cambria" w:hAnsi="Cambria" w:hint="eastAsia"/>
+        </w:rPr>
+        <w:t xml:space="preserve"> </w:t>
+      </w:r>
+      <w:r>
+        <w:rPr>
+          <w:rFonts w:ascii="Cambria" w:hAnsi="Cambria"/>
+        </w:rPr>
+        <w:t>[7]</w:t>
+      </w:r>
+      <w:r>
+        <w:rPr>
+          <w:rFonts w:ascii="Cambria" w:hAnsi="Cambria"/>
+        </w:rPr>
+        <w:t>.</w:t>
       </w:r>
       <w:r>
         <w:rPr>
@@ -150,7 +168,217 @@
           <w:rFonts w:ascii="Cambria" w:hAnsi="Cambria"/>
           <w:color w:val="000000" w:themeColor="text1"/>
         </w:rPr>
-        <w:t>We will use four EPIC tables—Patient Information, Patient Labs, Patient Procedure Events, and Patient Postoperative Complications—to address our research questions on predictors of postoperative hypoxemia. These tables collectively provide encounter-level demographics, preoperative test results, perioperative timestamps for the surgical encounter, and the postoperative complications used to define the hypoxemia outcome. For preoperative laboratory predictors, we focus on hematocrit and leukocyte (white blood cell) measurements.</w:t>
+        <w:t>We will use four EPIC tables</w:t>
+      </w:r>
+      <w:r>
+        <w:rPr>
+          <w:rFonts w:ascii="Cambria" w:hAnsi="Cambria"/>
+          <w:color w:val="000000" w:themeColor="text1"/>
+        </w:rPr>
+        <w:t xml:space="preserve"> </w:t>
+      </w:r>
+      <w:r>
+        <w:rPr>
+          <w:rFonts w:ascii="Cambria" w:hAnsi="Cambria"/>
+          <w:color w:val="000000" w:themeColor="text1"/>
+        </w:rPr>
+        <w:t xml:space="preserve">from the MOVER EPIC </w:t>
+      </w:r>
+      <w:r>
+        <w:rPr>
+          <w:rFonts w:ascii="Cambria" w:hAnsi="Cambria"/>
+          <w:color w:val="000000" w:themeColor="text1"/>
+        </w:rPr>
+        <w:t>dataset</w:t>
+      </w:r>
+      <w:r>
+        <w:rPr>
+          <w:rFonts w:ascii="Cambria" w:hAnsi="Cambria"/>
+          <w:color w:val="000000" w:themeColor="text1"/>
+        </w:rPr>
+        <w:t xml:space="preserve"> </w:t>
+      </w:r>
+      <w:r>
+        <w:rPr>
+          <w:rFonts w:ascii="Cambria" w:hAnsi="Cambria" w:hint="eastAsia"/>
+          <w:color w:val="000000" w:themeColor="text1"/>
+        </w:rPr>
+        <w:t>archive</w:t>
+      </w:r>
+      <w:r>
+        <w:rPr>
+          <w:rFonts w:ascii="Cambria" w:hAnsi="Cambria"/>
+          <w:color w:val="000000" w:themeColor="text1"/>
+        </w:rPr>
+        <w:t xml:space="preserve"> </w:t>
+      </w:r>
+      <w:r>
+        <w:rPr>
+          <w:rFonts w:ascii="Cambria" w:hAnsi="Cambria"/>
+          <w:color w:val="000000" w:themeColor="text1"/>
+        </w:rPr>
+        <w:t>(EPIC_EMR.tar.gz):</w:t>
+      </w:r>
+      <w:r>
+        <w:rPr>
+          <w:rFonts w:ascii="Cambria" w:hAnsi="Cambria"/>
+          <w:color w:val="000000" w:themeColor="text1"/>
+        </w:rPr>
+        <w:t xml:space="preserve"> </w:t>
+      </w:r>
+      <w:r>
+        <w:rPr>
+          <w:rFonts w:ascii="Cambria" w:hAnsi="Cambria"/>
+          <w:color w:val="000000" w:themeColor="text1"/>
+        </w:rPr>
+        <w:t>Patient Information</w:t>
+      </w:r>
+      <w:r>
+        <w:rPr>
+          <w:rFonts w:ascii="Cambria" w:hAnsi="Cambria"/>
+          <w:color w:val="000000" w:themeColor="text1"/>
+        </w:rPr>
+        <w:t xml:space="preserve"> (</w:t>
+      </w:r>
+      <w:r>
+        <w:rPr>
+          <w:rFonts w:ascii="Cambria" w:hAnsi="Cambria"/>
+          <w:color w:val="000000" w:themeColor="text1"/>
+        </w:rPr>
+        <w:t>patient_information.csv</w:t>
+      </w:r>
+      <w:r>
+        <w:rPr>
+          <w:rFonts w:ascii="Cambria" w:hAnsi="Cambria"/>
+          <w:color w:val="000000" w:themeColor="text1"/>
+        </w:rPr>
+        <w:t>)</w:t>
+      </w:r>
+      <w:r>
+        <w:rPr>
+          <w:rFonts w:ascii="Cambria" w:hAnsi="Cambria"/>
+          <w:color w:val="000000" w:themeColor="text1"/>
+        </w:rPr>
+        <w:t>, Patient Labs</w:t>
+      </w:r>
+      <w:r>
+        <w:rPr>
+          <w:rFonts w:ascii="Cambria" w:hAnsi="Cambria"/>
+          <w:color w:val="000000" w:themeColor="text1"/>
+        </w:rPr>
+        <w:t xml:space="preserve"> (</w:t>
+      </w:r>
+      <w:r>
+        <w:rPr>
+          <w:rFonts w:ascii="Cambria" w:hAnsi="Cambria"/>
+          <w:color w:val="000000" w:themeColor="text1"/>
+        </w:rPr>
+        <w:t>patient_labs.csv</w:t>
+      </w:r>
+      <w:r>
+        <w:rPr>
+          <w:rFonts w:ascii="Cambria" w:hAnsi="Cambria"/>
+          <w:color w:val="000000" w:themeColor="text1"/>
+        </w:rPr>
+        <w:t>)</w:t>
+      </w:r>
+      <w:r>
+        <w:rPr>
+          <w:rFonts w:ascii="Cambria" w:hAnsi="Cambria"/>
+          <w:color w:val="000000" w:themeColor="text1"/>
+        </w:rPr>
+        <w:t>, Patient Procedure Events</w:t>
+      </w:r>
+      <w:r>
+        <w:rPr>
+          <w:rFonts w:ascii="Cambria" w:hAnsi="Cambria"/>
+          <w:color w:val="000000" w:themeColor="text1"/>
+        </w:rPr>
+        <w:t xml:space="preserve"> (</w:t>
+      </w:r>
+      <w:r>
+        <w:rPr>
+          <w:rFonts w:ascii="Cambria" w:hAnsi="Cambria"/>
+          <w:color w:val="000000" w:themeColor="text1"/>
+        </w:rPr>
+        <w:t>patient_procedure</w:t>
+      </w:r>
+      <w:r>
+        <w:rPr>
+          <w:rFonts w:ascii="Cambria" w:hAnsi="Cambria"/>
+          <w:color w:val="000000" w:themeColor="text1"/>
+        </w:rPr>
+        <w:t>_</w:t>
+      </w:r>
+      <w:r>
+        <w:rPr>
+          <w:rFonts w:ascii="Cambria" w:hAnsi="Cambria"/>
+          <w:color w:val="000000" w:themeColor="text1"/>
+        </w:rPr>
+        <w:t>events.csv</w:t>
+      </w:r>
+      <w:r>
+        <w:rPr>
+          <w:rFonts w:ascii="Cambria" w:hAnsi="Cambria"/>
+          <w:color w:val="000000" w:themeColor="text1"/>
+        </w:rPr>
+        <w:t>)</w:t>
+      </w:r>
+      <w:r>
+        <w:rPr>
+          <w:rFonts w:ascii="Cambria" w:hAnsi="Cambria"/>
+          <w:color w:val="000000" w:themeColor="text1"/>
+        </w:rPr>
+        <w:t>, and Patient Postoperative Complications</w:t>
+      </w:r>
+      <w:r>
+        <w:rPr>
+          <w:rFonts w:ascii="Cambria" w:hAnsi="Cambria"/>
+          <w:color w:val="000000" w:themeColor="text1"/>
+        </w:rPr>
+        <w:t xml:space="preserve"> (</w:t>
+      </w:r>
+      <w:r>
+        <w:rPr>
+          <w:rFonts w:ascii="Cambria" w:hAnsi="Cambria"/>
+          <w:color w:val="000000" w:themeColor="text1"/>
+        </w:rPr>
+        <w:t>patient_post_op_complications.csv</w:t>
+      </w:r>
+      <w:r>
+        <w:rPr>
+          <w:rFonts w:ascii="Cambria" w:hAnsi="Cambria"/>
+          <w:color w:val="000000" w:themeColor="text1"/>
+        </w:rPr>
+        <w:t xml:space="preserve">). </w:t>
+      </w:r>
+      <w:r>
+        <w:rPr>
+          <w:rFonts w:ascii="Cambria" w:hAnsi="Cambria"/>
+          <w:color w:val="000000" w:themeColor="text1"/>
+        </w:rPr>
+        <w:t xml:space="preserve">These tables collectively provide encounter-level demographics, preoperative </w:t>
+      </w:r>
+      <w:r>
+        <w:rPr>
+          <w:rFonts w:ascii="Cambria" w:hAnsi="Cambria"/>
+          <w:color w:val="000000" w:themeColor="text1"/>
+        </w:rPr>
+        <w:t>laboratory</w:t>
+      </w:r>
+      <w:r>
+        <w:rPr>
+          <w:rFonts w:ascii="Cambria" w:hAnsi="Cambria"/>
+          <w:color w:val="000000" w:themeColor="text1"/>
+        </w:rPr>
+        <w:t xml:space="preserve"> </w:t>
+      </w:r>
+      <w:r>
+        <w:rPr>
+          <w:rFonts w:ascii="Cambria" w:hAnsi="Cambria"/>
+          <w:color w:val="000000" w:themeColor="text1"/>
+        </w:rPr>
+        <w:t>test results, perioperative timestamps for the surgical encounter, and the postoperative complications used to define the hypoxemia outcome. For preoperative laboratory predictors, we focus on hematocrit and leukocyte (white blood cell) measurements.</w:t>
       </w:r>
     </w:p>
     <w:p>
@@ -209,16 +437,16 @@
         <w:tblLook w:val="04A0" w:firstRow="1" w:lastRow="0" w:firstColumn="1" w:lastColumn="0" w:noHBand="0" w:noVBand="1"/>
       </w:tblPr>
       <w:tblGrid>
-        <w:gridCol w:w="1609"/>
-        <w:gridCol w:w="1557"/>
-        <w:gridCol w:w="2504"/>
-        <w:gridCol w:w="1436"/>
-        <w:gridCol w:w="1288"/>
+        <w:gridCol w:w="1974"/>
+        <w:gridCol w:w="1565"/>
+        <w:gridCol w:w="2552"/>
+        <w:gridCol w:w="1275"/>
+        <w:gridCol w:w="1418"/>
       </w:tblGrid>
       <w:tr>
         <w:tc>
           <w:tcPr>
-            <w:tcW w:w="1609" w:type="dxa"/>
+            <w:tcW w:w="1974" w:type="dxa"/>
           </w:tcPr>
           <w:p>
             <w:pPr>
@@ -236,7 +464,7 @@
         </w:tc>
         <w:tc>
           <w:tcPr>
-            <w:tcW w:w="1557" w:type="dxa"/>
+            <w:tcW w:w="1565" w:type="dxa"/>
           </w:tcPr>
           <w:p>
             <w:pPr>
@@ -254,7 +482,7 @@
         </w:tc>
         <w:tc>
           <w:tcPr>
-            <w:tcW w:w="2504" w:type="dxa"/>
+            <w:tcW w:w="2552" w:type="dxa"/>
           </w:tcPr>
           <w:p>
             <w:pPr>
@@ -272,7 +500,7 @@
         </w:tc>
         <w:tc>
           <w:tcPr>
-            <w:tcW w:w="1436" w:type="dxa"/>
+            <w:tcW w:w="1275" w:type="dxa"/>
           </w:tcPr>
           <w:p>
             <w:pPr>
@@ -290,7 +518,7 @@
         </w:tc>
         <w:tc>
           <w:tcPr>
-            <w:tcW w:w="1288" w:type="dxa"/>
+            <w:tcW w:w="1418" w:type="dxa"/>
           </w:tcPr>
           <w:p>
             <w:pPr>
@@ -310,7 +538,7 @@
       <w:tr>
         <w:tc>
           <w:tcPr>
-            <w:tcW w:w="1609" w:type="dxa"/>
+            <w:tcW w:w="1974" w:type="dxa"/>
           </w:tcPr>
           <w:p>
             <w:pPr>
@@ -328,7 +556,7 @@
         </w:tc>
         <w:tc>
           <w:tcPr>
-            <w:tcW w:w="1557" w:type="dxa"/>
+            <w:tcW w:w="1565" w:type="dxa"/>
           </w:tcPr>
           <w:p>
             <w:pPr>
@@ -347,7 +575,7 @@
         </w:tc>
         <w:tc>
           <w:tcPr>
-            <w:tcW w:w="2504" w:type="dxa"/>
+            <w:tcW w:w="2552" w:type="dxa"/>
           </w:tcPr>
           <w:p>
             <w:pPr>
@@ -365,7 +593,7 @@
         </w:tc>
         <w:tc>
           <w:tcPr>
-            <w:tcW w:w="1436" w:type="dxa"/>
+            <w:tcW w:w="1275" w:type="dxa"/>
           </w:tcPr>
           <w:p>
             <w:pPr>
@@ -383,19 +611,19 @@
         </w:tc>
         <w:tc>
           <w:tcPr>
-            <w:tcW w:w="1288" w:type="dxa"/>
-          </w:tcPr>
-          <w:p>
-            <w:pPr>
-              <w:rPr>
-                <w:rFonts w:ascii="Cambria" w:hAnsi="Cambria"/>
-              </w:rPr>
-            </w:pPr>
-            <w:r>
-              <w:rPr>
-                <w:rFonts w:ascii="Cambria" w:hAnsi="Cambria"/>
-              </w:rPr>
-              <w:t>Binary</w:t>
+            <w:tcW w:w="1418" w:type="dxa"/>
+          </w:tcPr>
+          <w:p>
+            <w:pPr>
+              <w:rPr>
+                <w:rFonts w:ascii="Cambria" w:hAnsi="Cambria"/>
+              </w:rPr>
+            </w:pPr>
+            <w:r>
+              <w:rPr>
+                <w:rFonts w:ascii="Cambria" w:hAnsi="Cambria"/>
+              </w:rPr>
+              <w:t>Character</w:t>
             </w:r>
           </w:p>
         </w:tc>
@@ -403,7 +631,7 @@
       <w:tr>
         <w:tc>
           <w:tcPr>
-            <w:tcW w:w="1609" w:type="dxa"/>
+            <w:tcW w:w="1974" w:type="dxa"/>
           </w:tcPr>
           <w:p>
             <w:pPr>
@@ -429,7 +657,7 @@
         </w:tc>
         <w:tc>
           <w:tcPr>
-            <w:tcW w:w="1557" w:type="dxa"/>
+            <w:tcW w:w="1565" w:type="dxa"/>
           </w:tcPr>
           <w:p>
             <w:pPr>
@@ -448,7 +676,7 @@
         </w:tc>
         <w:tc>
           <w:tcPr>
-            <w:tcW w:w="2504" w:type="dxa"/>
+            <w:tcW w:w="2552" w:type="dxa"/>
           </w:tcPr>
           <w:p>
             <w:pPr>
@@ -478,7 +706,7 @@
         </w:tc>
         <w:tc>
           <w:tcPr>
-            <w:tcW w:w="1436" w:type="dxa"/>
+            <w:tcW w:w="1275" w:type="dxa"/>
           </w:tcPr>
           <w:p>
             <w:pPr>
@@ -496,7 +724,7 @@
         </w:tc>
         <w:tc>
           <w:tcPr>
-            <w:tcW w:w="1288" w:type="dxa"/>
+            <w:tcW w:w="1418" w:type="dxa"/>
           </w:tcPr>
           <w:p>
             <w:pPr>
@@ -516,7 +744,7 @@
       <w:tr>
         <w:tc>
           <w:tcPr>
-            <w:tcW w:w="1609" w:type="dxa"/>
+            <w:tcW w:w="1974" w:type="dxa"/>
             <w:tcBorders>
               <w:bottom w:val="single" w:sz="4" w:space="0" w:color="auto"/>
             </w:tcBorders>
@@ -537,7 +765,7 @@
               <w:rPr>
                 <w:rFonts w:ascii="Cambria" w:hAnsi="Cambria"/>
               </w:rPr>
-              <w:t>Hematocrit, Leukocytes</w:t>
+              <w:t>leukocytes, pH, hematocrit, CRP, lactate, carbon dioxide, sodium, glucose, hemoglobin, potassium</w:t>
             </w:r>
             <w:r>
               <w:rPr>
@@ -549,7 +777,7 @@
         </w:tc>
         <w:tc>
           <w:tcPr>
-            <w:tcW w:w="1557" w:type="dxa"/>
+            <w:tcW w:w="1565" w:type="dxa"/>
             <w:tcBorders>
               <w:bottom w:val="single" w:sz="4" w:space="0" w:color="auto"/>
             </w:tcBorders>
@@ -570,7 +798,7 @@
         </w:tc>
         <w:tc>
           <w:tcPr>
-            <w:tcW w:w="2504" w:type="dxa"/>
+            <w:tcW w:w="2552" w:type="dxa"/>
             <w:tcBorders>
               <w:bottom w:val="single" w:sz="4" w:space="0" w:color="auto"/>
             </w:tcBorders>
@@ -585,7 +813,27 @@
               <w:rPr>
                 <w:rFonts w:ascii="Cambria" w:hAnsi="Cambria"/>
               </w:rPr>
-              <w:t xml:space="preserve">Lab.Code, Observation.Value, </w:t>
+              <w:t xml:space="preserve">Lab.Code, </w:t>
+            </w:r>
+            <w:proofErr w:type="spellStart"/>
+            <w:r>
+              <w:rPr>
+                <w:rFonts w:ascii="Cambria" w:hAnsi="Cambria"/>
+              </w:rPr>
+              <w:t>Lab.Name</w:t>
+            </w:r>
+            <w:proofErr w:type="spellEnd"/>
+            <w:r>
+              <w:rPr>
+                <w:rFonts w:ascii="Cambria" w:hAnsi="Cambria"/>
+              </w:rPr>
+              <w:t xml:space="preserve">, </w:t>
+            </w:r>
+            <w:r>
+              <w:rPr>
+                <w:rFonts w:ascii="Cambria" w:hAnsi="Cambria"/>
+              </w:rPr>
+              <w:t xml:space="preserve">Observation.Value, </w:t>
             </w:r>
             <w:r>
               <w:rPr>
@@ -604,7 +852,7 @@
         </w:tc>
         <w:tc>
           <w:tcPr>
-            <w:tcW w:w="1436" w:type="dxa"/>
+            <w:tcW w:w="1275" w:type="dxa"/>
             <w:tcBorders>
               <w:bottom w:val="single" w:sz="4" w:space="0" w:color="auto"/>
             </w:tcBorders>
@@ -625,7 +873,7 @@
         </w:tc>
         <w:tc>
           <w:tcPr>
-            <w:tcW w:w="1288" w:type="dxa"/>
+            <w:tcW w:w="1418" w:type="dxa"/>
             <w:tcBorders>
               <w:bottom w:val="single" w:sz="4" w:space="0" w:color="auto"/>
             </w:tcBorders>
@@ -640,15 +888,64 @@
               <w:rPr>
                 <w:rFonts w:ascii="Cambria" w:hAnsi="Cambria"/>
               </w:rPr>
+              <w:t>Character</w:t>
+            </w:r>
+            <w:r>
+              <w:rPr>
+                <w:rFonts w:ascii="Cambria" w:hAnsi="Cambria"/>
+              </w:rPr>
+              <w:t xml:space="preserve">, </w:t>
+            </w:r>
+            <w:r>
+              <w:rPr>
+                <w:rFonts w:ascii="Cambria" w:hAnsi="Cambria"/>
+              </w:rPr>
+              <w:t>Character</w:t>
+            </w:r>
+            <w:r>
+              <w:rPr>
+                <w:rFonts w:ascii="Cambria" w:hAnsi="Cambria"/>
+              </w:rPr>
+              <w:t xml:space="preserve">, </w:t>
+            </w:r>
+            <w:r>
+              <w:rPr>
+                <w:rFonts w:ascii="Cambria" w:hAnsi="Cambria"/>
+              </w:rPr>
               <w:t>Numeric</w:t>
             </w:r>
+            <w:r>
+              <w:rPr>
+                <w:rFonts w:ascii="Cambria" w:hAnsi="Cambria"/>
+              </w:rPr>
+              <w:t xml:space="preserve"> / Categorical, </w:t>
+            </w:r>
+            <w:r>
+              <w:rPr>
+                <w:rFonts w:ascii="Cambria" w:hAnsi="Cambria"/>
+              </w:rPr>
+              <w:t>Character</w:t>
+            </w:r>
+            <w:r>
+              <w:rPr>
+                <w:rFonts w:ascii="Cambria" w:hAnsi="Cambria"/>
+              </w:rPr>
+              <w:t>, Datetime</w:t>
+            </w:r>
+          </w:p>
+          <w:p>
+            <w:pPr>
+              <w:rPr>
+                <w:rFonts w:ascii="Cambria" w:hAnsi="Cambria"/>
+              </w:rPr>
+            </w:pPr>
           </w:p>
         </w:tc>
       </w:tr>
       <w:tr>
         <w:tc>
           <w:tcPr>
-            <w:tcW w:w="1609" w:type="dxa"/>
+            <w:tcW w:w="1974" w:type="dxa"/>
             <w:shd w:val="clear" w:color="auto" w:fill="D9D9D9" w:themeFill="background1" w:themeFillShade="D9"/>
           </w:tcPr>
           <w:p>
@@ -667,7 +964,7 @@
         </w:tc>
         <w:tc>
           <w:tcPr>
-            <w:tcW w:w="1557" w:type="dxa"/>
+            <w:tcW w:w="1565" w:type="dxa"/>
             <w:shd w:val="clear" w:color="auto" w:fill="D9D9D9" w:themeFill="background1" w:themeFillShade="D9"/>
           </w:tcPr>
           <w:p>
@@ -687,7 +984,7 @@
         </w:tc>
         <w:tc>
           <w:tcPr>
-            <w:tcW w:w="2504" w:type="dxa"/>
+            <w:tcW w:w="2552" w:type="dxa"/>
             <w:shd w:val="clear" w:color="auto" w:fill="D9D9D9" w:themeFill="background1" w:themeFillShade="D9"/>
           </w:tcPr>
           <w:p>
@@ -706,7 +1003,7 @@
         </w:tc>
         <w:tc>
           <w:tcPr>
-            <w:tcW w:w="1436" w:type="dxa"/>
+            <w:tcW w:w="1275" w:type="dxa"/>
             <w:shd w:val="clear" w:color="auto" w:fill="D9D9D9" w:themeFill="background1" w:themeFillShade="D9"/>
           </w:tcPr>
           <w:p>
@@ -725,7 +1022,7 @@
         </w:tc>
         <w:tc>
           <w:tcPr>
-            <w:tcW w:w="1288" w:type="dxa"/>
+            <w:tcW w:w="1418" w:type="dxa"/>
             <w:shd w:val="clear" w:color="auto" w:fill="D9D9D9" w:themeFill="background1" w:themeFillShade="D9"/>
           </w:tcPr>
           <w:p>
@@ -734,6 +1031,12 @@
                 <w:rFonts w:ascii="Cambria" w:hAnsi="Cambria"/>
               </w:rPr>
             </w:pPr>
+            <w:r>
+              <w:rPr>
+                <w:rFonts w:ascii="Cambria" w:hAnsi="Cambria"/>
+              </w:rPr>
+              <w:t xml:space="preserve">Character, </w:t>
+            </w:r>
             <w:r>
               <w:rPr>
                 <w:rFonts w:ascii="Cambria" w:hAnsi="Cambria"/>
@@ -760,6 +1063,7 @@
           <w:sz w:val="20"/>
           <w:szCs w:val="20"/>
         </w:rPr>
+        <w:lastRenderedPageBreak/>
         <w:t>Table 1. Construct-to-variable mapping (encounter key: LOG_ID).</w:t>
       </w:r>
     </w:p>
@@ -818,6 +1122,763 @@
         </w:rPr>
       </w:pPr>
     </w:p>
+    <w:tbl>
+      <w:tblPr>
+        <w:tblStyle w:val="TableGrid"/>
+        <w:tblW w:w="0" w:type="auto"/>
+        <w:tblLayout w:type="fixed"/>
+        <w:tblLook w:val="04A0" w:firstRow="1" w:lastRow="0" w:firstColumn="1" w:lastColumn="0" w:noHBand="0" w:noVBand="1"/>
+      </w:tblPr>
+      <w:tblGrid>
+        <w:gridCol w:w="1714"/>
+        <w:gridCol w:w="1560"/>
+        <w:gridCol w:w="1541"/>
+        <w:gridCol w:w="1579"/>
+        <w:gridCol w:w="1271"/>
+        <w:gridCol w:w="1351"/>
+      </w:tblGrid>
+      <w:tr>
+        <w:tc>
+          <w:tcPr>
+            <w:tcW w:w="1714" w:type="dxa"/>
+          </w:tcPr>
+          <w:p>
+            <w:pPr>
+              <w:rPr>
+                <w:rFonts w:ascii="Cambria" w:hAnsi="Cambria" w:hint="eastAsia"/>
+              </w:rPr>
+            </w:pPr>
+            <w:r>
+              <w:rPr>
+                <w:rFonts w:ascii="Cambria" w:hAnsi="Cambria"/>
+              </w:rPr>
+              <w:t>Construct</w:t>
+            </w:r>
+          </w:p>
+        </w:tc>
+        <w:tc>
+          <w:tcPr>
+            <w:tcW w:w="1560" w:type="dxa"/>
+          </w:tcPr>
+          <w:p>
+            <w:pPr>
+              <w:rPr>
+                <w:rFonts w:ascii="Cambria" w:hAnsi="Cambria"/>
+              </w:rPr>
+            </w:pPr>
+            <w:r>
+              <w:rPr>
+                <w:rFonts w:ascii="Cambria" w:hAnsi="Cambria"/>
+              </w:rPr>
+              <w:t>Table</w:t>
+            </w:r>
+          </w:p>
+        </w:tc>
+        <w:tc>
+          <w:tcPr>
+            <w:tcW w:w="1541" w:type="dxa"/>
+          </w:tcPr>
+          <w:p>
+            <w:pPr>
+              <w:rPr>
+                <w:rFonts w:ascii="Cambria" w:hAnsi="Cambria" w:hint="eastAsia"/>
+              </w:rPr>
+            </w:pPr>
+            <w:r>
+              <w:rPr>
+                <w:rFonts w:ascii="Cambria" w:hAnsi="Cambria"/>
+              </w:rPr>
+              <w:t xml:space="preserve">Raw </w:t>
+            </w:r>
+            <w:r>
+              <w:rPr>
+                <w:rFonts w:ascii="Cambria" w:hAnsi="Cambria"/>
+              </w:rPr>
+              <w:t>Columns</w:t>
+            </w:r>
+          </w:p>
+        </w:tc>
+        <w:tc>
+          <w:tcPr>
+            <w:tcW w:w="1579" w:type="dxa"/>
+          </w:tcPr>
+          <w:p>
+            <w:pPr>
+              <w:rPr>
+                <w:rFonts w:ascii="Cambria" w:hAnsi="Cambria"/>
+              </w:rPr>
+            </w:pPr>
+            <w:r>
+              <w:rPr>
+                <w:rFonts w:ascii="Cambria" w:hAnsi="Cambria"/>
+              </w:rPr>
+              <w:t xml:space="preserve">Mapped </w:t>
+            </w:r>
+            <w:r>
+              <w:rPr>
+                <w:rFonts w:ascii="Cambria" w:hAnsi="Cambria"/>
+              </w:rPr>
+              <w:t>A</w:t>
+            </w:r>
+            <w:r>
+              <w:rPr>
+                <w:rFonts w:ascii="Cambria" w:hAnsi="Cambria"/>
+              </w:rPr>
+              <w:t xml:space="preserve">nalytic </w:t>
+            </w:r>
+            <w:r>
+              <w:rPr>
+                <w:rFonts w:ascii="Cambria" w:hAnsi="Cambria"/>
+              </w:rPr>
+              <w:t>V</w:t>
+            </w:r>
+            <w:r>
+              <w:rPr>
+                <w:rFonts w:ascii="Cambria" w:hAnsi="Cambria"/>
+              </w:rPr>
+              <w:t>ariable</w:t>
+            </w:r>
+            <w:r>
+              <w:rPr>
+                <w:rFonts w:ascii="Cambria" w:hAnsi="Cambria"/>
+              </w:rPr>
+              <w:t>s</w:t>
+            </w:r>
+          </w:p>
+        </w:tc>
+        <w:tc>
+          <w:tcPr>
+            <w:tcW w:w="1271" w:type="dxa"/>
+          </w:tcPr>
+          <w:p>
+            <w:pPr>
+              <w:rPr>
+                <w:rFonts w:ascii="Cambria" w:hAnsi="Cambria"/>
+              </w:rPr>
+            </w:pPr>
+            <w:r>
+              <w:rPr>
+                <w:rFonts w:ascii="Cambria" w:hAnsi="Cambria"/>
+              </w:rPr>
+              <w:t>Level</w:t>
+            </w:r>
+          </w:p>
+        </w:tc>
+        <w:tc>
+          <w:tcPr>
+            <w:tcW w:w="1351" w:type="dxa"/>
+          </w:tcPr>
+          <w:p>
+            <w:pPr>
+              <w:rPr>
+                <w:rFonts w:ascii="Cambria" w:hAnsi="Cambria"/>
+              </w:rPr>
+            </w:pPr>
+            <w:r>
+              <w:rPr>
+                <w:rFonts w:ascii="Cambria" w:hAnsi="Cambria"/>
+              </w:rPr>
+              <w:t>Type</w:t>
+            </w:r>
+          </w:p>
+        </w:tc>
+      </w:tr>
+      <w:tr>
+        <w:tc>
+          <w:tcPr>
+            <w:tcW w:w="1714" w:type="dxa"/>
+          </w:tcPr>
+          <w:p>
+            <w:pPr>
+              <w:rPr>
+                <w:rFonts w:ascii="Cambria" w:hAnsi="Cambria"/>
+              </w:rPr>
+            </w:pPr>
+            <w:r>
+              <w:rPr>
+                <w:rFonts w:ascii="Cambria" w:hAnsi="Cambria"/>
+              </w:rPr>
+              <w:t>Postoperative hypoxemia (outcome)</w:t>
+            </w:r>
+          </w:p>
+        </w:tc>
+        <w:tc>
+          <w:tcPr>
+            <w:tcW w:w="1560" w:type="dxa"/>
+          </w:tcPr>
+          <w:p>
+            <w:pPr>
+              <w:rPr>
+                <w:rFonts w:ascii="Cambria" w:hAnsi="Cambria"/>
+              </w:rPr>
+            </w:pPr>
+            <w:r>
+              <w:rPr>
+                <w:rFonts w:ascii="Cambria" w:hAnsi="Cambria"/>
+                <w:color w:val="000000" w:themeColor="text1"/>
+              </w:rPr>
+              <w:t>Patient Postoperative Complications</w:t>
+            </w:r>
+          </w:p>
+        </w:tc>
+        <w:tc>
+          <w:tcPr>
+            <w:tcW w:w="1541" w:type="dxa"/>
+          </w:tcPr>
+          <w:p>
+            <w:pPr>
+              <w:rPr>
+                <w:rFonts w:ascii="Cambria" w:hAnsi="Cambria" w:hint="eastAsia"/>
+              </w:rPr>
+            </w:pPr>
+            <w:r>
+              <w:rPr>
+                <w:rFonts w:ascii="Cambria" w:hAnsi="Cambria"/>
+              </w:rPr>
+              <w:t>SMRTDTA_ELEM_VALUE</w:t>
+            </w:r>
+          </w:p>
+        </w:tc>
+        <w:tc>
+          <w:tcPr>
+            <w:tcW w:w="1579" w:type="dxa"/>
+          </w:tcPr>
+          <w:p>
+            <w:pPr>
+              <w:rPr>
+                <w:rFonts w:ascii="Cambria" w:hAnsi="Cambria"/>
+              </w:rPr>
+            </w:pPr>
+            <w:r>
+              <w:rPr>
+                <w:rFonts w:ascii="Cambria" w:hAnsi="Cambria"/>
+              </w:rPr>
+              <w:t>hypoxemia</w:t>
+            </w:r>
+          </w:p>
+        </w:tc>
+        <w:tc>
+          <w:tcPr>
+            <w:tcW w:w="1271" w:type="dxa"/>
+          </w:tcPr>
+          <w:p>
+            <w:pPr>
+              <w:rPr>
+                <w:rFonts w:ascii="Cambria" w:hAnsi="Cambria"/>
+              </w:rPr>
+            </w:pPr>
+            <w:r>
+              <w:rPr>
+                <w:rFonts w:ascii="Cambria" w:hAnsi="Cambria"/>
+              </w:rPr>
+              <w:t>Encounter</w:t>
+            </w:r>
+          </w:p>
+        </w:tc>
+        <w:tc>
+          <w:tcPr>
+            <w:tcW w:w="1351" w:type="dxa"/>
+          </w:tcPr>
+          <w:p>
+            <w:pPr>
+              <w:rPr>
+                <w:rFonts w:ascii="Cambria" w:hAnsi="Cambria"/>
+              </w:rPr>
+            </w:pPr>
+            <w:r>
+              <w:rPr>
+                <w:rFonts w:ascii="Cambria" w:hAnsi="Cambria"/>
+              </w:rPr>
+              <w:t>binary</w:t>
+            </w:r>
+          </w:p>
+        </w:tc>
+      </w:tr>
+      <w:tr>
+        <w:tc>
+          <w:tcPr>
+            <w:tcW w:w="1714" w:type="dxa"/>
+          </w:tcPr>
+          <w:p>
+            <w:pPr>
+              <w:rPr>
+                <w:rFonts w:ascii="Cambria" w:hAnsi="Cambria"/>
+              </w:rPr>
+            </w:pPr>
+            <w:r>
+              <w:rPr>
+                <w:rFonts w:ascii="Cambria" w:hAnsi="Cambria"/>
+                <w:color w:val="000000" w:themeColor="text1"/>
+              </w:rPr>
+              <w:t>Demographics</w:t>
+            </w:r>
+            <w:r>
+              <w:rPr>
+                <w:rFonts w:ascii="Cambria" w:hAnsi="Cambria"/>
+                <w:color w:val="000000" w:themeColor="text1"/>
+              </w:rPr>
+              <w:t xml:space="preserve"> (age, sex, BMI)</w:t>
+            </w:r>
+          </w:p>
+        </w:tc>
+        <w:tc>
+          <w:tcPr>
+            <w:tcW w:w="1560" w:type="dxa"/>
+          </w:tcPr>
+          <w:p>
+            <w:pPr>
+              <w:rPr>
+                <w:rFonts w:ascii="Cambria" w:hAnsi="Cambria"/>
+              </w:rPr>
+            </w:pPr>
+            <w:r>
+              <w:rPr>
+                <w:rFonts w:ascii="Cambria" w:hAnsi="Cambria"/>
+                <w:color w:val="000000" w:themeColor="text1"/>
+              </w:rPr>
+              <w:t>Patient Information</w:t>
+            </w:r>
+          </w:p>
+        </w:tc>
+        <w:tc>
+          <w:tcPr>
+            <w:tcW w:w="1541" w:type="dxa"/>
+          </w:tcPr>
+          <w:p>
+            <w:pPr>
+              <w:rPr>
+                <w:rFonts w:ascii="Cambria" w:hAnsi="Cambria" w:hint="eastAsia"/>
+              </w:rPr>
+            </w:pPr>
+            <w:r>
+              <w:rPr>
+                <w:rFonts w:ascii="Cambria" w:hAnsi="Cambria"/>
+              </w:rPr>
+              <w:t>BIRTH_DATE, SEX</w:t>
+            </w:r>
+            <w:r>
+              <w:rPr>
+                <w:rFonts w:ascii="Cambria" w:hAnsi="Cambria"/>
+              </w:rPr>
+              <w:t xml:space="preserve">, </w:t>
+            </w:r>
+            <w:r>
+              <w:rPr>
+                <w:rFonts w:ascii="Cambria" w:hAnsi="Cambria"/>
+              </w:rPr>
+              <w:t>HEIGHT, WEIGHT</w:t>
+            </w:r>
+          </w:p>
+        </w:tc>
+        <w:tc>
+          <w:tcPr>
+            <w:tcW w:w="1579" w:type="dxa"/>
+          </w:tcPr>
+          <w:p>
+            <w:pPr>
+              <w:rPr>
+                <w:rFonts w:ascii="Cambria" w:hAnsi="Cambria"/>
+              </w:rPr>
+            </w:pPr>
+            <w:r>
+              <w:rPr>
+                <w:rFonts w:ascii="Cambria" w:hAnsi="Cambria"/>
+              </w:rPr>
+              <w:t xml:space="preserve">age, sex, </w:t>
+            </w:r>
+            <w:proofErr w:type="spellStart"/>
+            <w:r>
+              <w:rPr>
+                <w:rFonts w:ascii="Cambria" w:hAnsi="Cambria"/>
+              </w:rPr>
+              <w:t>bmi</w:t>
+            </w:r>
+            <w:proofErr w:type="spellEnd"/>
+          </w:p>
+        </w:tc>
+        <w:tc>
+          <w:tcPr>
+            <w:tcW w:w="1271" w:type="dxa"/>
+          </w:tcPr>
+          <w:p>
+            <w:pPr>
+              <w:rPr>
+                <w:rFonts w:ascii="Cambria" w:hAnsi="Cambria"/>
+              </w:rPr>
+            </w:pPr>
+            <w:r>
+              <w:rPr>
+                <w:rFonts w:ascii="Cambria" w:hAnsi="Cambria"/>
+              </w:rPr>
+              <w:t>Encounter</w:t>
+            </w:r>
+          </w:p>
+        </w:tc>
+        <w:tc>
+          <w:tcPr>
+            <w:tcW w:w="1351" w:type="dxa"/>
+          </w:tcPr>
+          <w:p>
+            <w:pPr>
+              <w:rPr>
+                <w:rFonts w:ascii="Cambria" w:hAnsi="Cambria"/>
+              </w:rPr>
+            </w:pPr>
+            <w:r>
+              <w:rPr>
+                <w:rFonts w:ascii="Cambria" w:hAnsi="Cambria"/>
+              </w:rPr>
+              <w:t>Numeric / Categorical</w:t>
+            </w:r>
+          </w:p>
+        </w:tc>
+      </w:tr>
+      <w:tr>
+        <w:tc>
+          <w:tcPr>
+            <w:tcW w:w="1714" w:type="dxa"/>
+            <w:tcBorders>
+              <w:bottom w:val="single" w:sz="4" w:space="0" w:color="auto"/>
+            </w:tcBorders>
+          </w:tcPr>
+          <w:p>
+            <w:pPr>
+              <w:rPr>
+                <w:rFonts w:ascii="Cambria" w:hAnsi="Cambria"/>
+              </w:rPr>
+            </w:pPr>
+            <w:r>
+              <w:rPr>
+                <w:rFonts w:ascii="Cambria" w:hAnsi="Cambria"/>
+              </w:rPr>
+              <w:t>Lab test result (</w:t>
+            </w:r>
+            <w:r>
+              <w:rPr>
+                <w:rFonts w:ascii="Cambria" w:hAnsi="Cambria"/>
+              </w:rPr>
+              <w:t>leukocytes, pH, hematocrit, CRP, lactate, carbon dioxide, sodium, glucose, hemoglobin, potassium</w:t>
+            </w:r>
+            <w:r>
+              <w:rPr>
+                <w:rFonts w:ascii="Cambria" w:hAnsi="Cambria"/>
+              </w:rPr>
+              <w:t>)</w:t>
+            </w:r>
+          </w:p>
+        </w:tc>
+        <w:tc>
+          <w:tcPr>
+            <w:tcW w:w="1560" w:type="dxa"/>
+            <w:tcBorders>
+              <w:bottom w:val="single" w:sz="4" w:space="0" w:color="auto"/>
+            </w:tcBorders>
+          </w:tcPr>
+          <w:p>
+            <w:pPr>
+              <w:rPr>
+                <w:rFonts w:ascii="Cambria" w:hAnsi="Cambria"/>
+              </w:rPr>
+            </w:pPr>
+            <w:r>
+              <w:rPr>
+                <w:rFonts w:ascii="Cambria" w:hAnsi="Cambria"/>
+              </w:rPr>
+              <w:t>Patient Labs</w:t>
+            </w:r>
+          </w:p>
+        </w:tc>
+        <w:tc>
+          <w:tcPr>
+            <w:tcW w:w="1541" w:type="dxa"/>
+            <w:tcBorders>
+              <w:bottom w:val="single" w:sz="4" w:space="0" w:color="auto"/>
+            </w:tcBorders>
+          </w:tcPr>
+          <w:p>
+            <w:pPr>
+              <w:rPr>
+                <w:rFonts w:ascii="Cambria" w:hAnsi="Cambria"/>
+              </w:rPr>
+            </w:pPr>
+            <w:r>
+              <w:rPr>
+                <w:rFonts w:ascii="Cambria" w:hAnsi="Cambria"/>
+              </w:rPr>
+              <w:t xml:space="preserve">Lab.Code, Observation.Value, </w:t>
+            </w:r>
+            <w:r>
+              <w:rPr>
+                <w:rFonts w:ascii="Cambria" w:hAnsi="Cambria"/>
+              </w:rPr>
+              <w:t xml:space="preserve">Measurement.Units, </w:t>
+            </w:r>
+            <w:r>
+              <w:rPr>
+                <w:rFonts w:ascii="Cambria" w:hAnsi="Cambria"/>
+                <w:shd w:val="pct15" w:color="auto" w:fill="FFFFFF"/>
+              </w:rPr>
+              <w:t>Collection.Datetime</w:t>
+            </w:r>
+          </w:p>
+        </w:tc>
+        <w:tc>
+          <w:tcPr>
+            <w:tcW w:w="1579" w:type="dxa"/>
+            <w:tcBorders>
+              <w:bottom w:val="single" w:sz="4" w:space="0" w:color="auto"/>
+            </w:tcBorders>
+          </w:tcPr>
+          <w:p>
+            <w:pPr>
+              <w:rPr>
+                <w:rFonts w:ascii="Cambria" w:hAnsi="Cambria"/>
+              </w:rPr>
+            </w:pPr>
+            <w:r>
+              <w:rPr>
+                <w:rFonts w:ascii="Cambria" w:hAnsi="Cambria"/>
+              </w:rPr>
+              <w:t>lab_</w:t>
+            </w:r>
+            <w:r>
+              <w:rPr>
+                <w:rFonts w:ascii="Cambria" w:hAnsi="Cambria"/>
+              </w:rPr>
+              <w:t xml:space="preserve"> </w:t>
+            </w:r>
+            <w:r>
+              <w:rPr>
+                <w:rFonts w:ascii="Cambria" w:hAnsi="Cambria"/>
+              </w:rPr>
+              <w:t>leukocytes</w:t>
+            </w:r>
+            <w:r>
+              <w:rPr>
+                <w:rFonts w:ascii="Cambria" w:hAnsi="Cambria"/>
+              </w:rPr>
+              <w:t xml:space="preserve">, </w:t>
+            </w:r>
+            <w:proofErr w:type="spellStart"/>
+            <w:r>
+              <w:rPr>
+                <w:rFonts w:ascii="Cambria" w:hAnsi="Cambria"/>
+              </w:rPr>
+              <w:t>lab_pH</w:t>
+            </w:r>
+            <w:proofErr w:type="spellEnd"/>
+            <w:r>
+              <w:rPr>
+                <w:rFonts w:ascii="Cambria" w:hAnsi="Cambria"/>
+              </w:rPr>
+              <w:t>, lab_</w:t>
+            </w:r>
+            <w:r>
+              <w:rPr>
+                <w:rFonts w:ascii="Cambria" w:hAnsi="Cambria"/>
+              </w:rPr>
+              <w:t xml:space="preserve"> </w:t>
+            </w:r>
+            <w:r>
+              <w:rPr>
+                <w:rFonts w:ascii="Cambria" w:hAnsi="Cambria"/>
+              </w:rPr>
+              <w:t>hematocrit</w:t>
+            </w:r>
+            <w:r>
+              <w:rPr>
+                <w:rFonts w:ascii="Cambria" w:hAnsi="Cambria"/>
+              </w:rPr>
+              <w:t>, lab_</w:t>
+            </w:r>
+            <w:r>
+              <w:rPr>
+                <w:rFonts w:ascii="Cambria" w:hAnsi="Cambria"/>
+              </w:rPr>
+              <w:t xml:space="preserve"> </w:t>
+            </w:r>
+            <w:r>
+              <w:rPr>
+                <w:rFonts w:ascii="Cambria" w:hAnsi="Cambria"/>
+              </w:rPr>
+              <w:t>CRP</w:t>
+            </w:r>
+            <w:r>
+              <w:rPr>
+                <w:rFonts w:ascii="Cambria" w:hAnsi="Cambria"/>
+              </w:rPr>
+              <w:t>, …</w:t>
+            </w:r>
+          </w:p>
+        </w:tc>
+        <w:tc>
+          <w:tcPr>
+            <w:tcW w:w="1271" w:type="dxa"/>
+            <w:tcBorders>
+              <w:bottom w:val="single" w:sz="4" w:space="0" w:color="auto"/>
+            </w:tcBorders>
+          </w:tcPr>
+          <w:p>
+            <w:pPr>
+              <w:rPr>
+                <w:rFonts w:ascii="Cambria" w:hAnsi="Cambria"/>
+              </w:rPr>
+            </w:pPr>
+            <w:r>
+              <w:rPr>
+                <w:rFonts w:ascii="Cambria" w:hAnsi="Cambria"/>
+              </w:rPr>
+              <w:t>Encounter-lab record</w:t>
+            </w:r>
+          </w:p>
+        </w:tc>
+        <w:tc>
+          <w:tcPr>
+            <w:tcW w:w="1351" w:type="dxa"/>
+            <w:tcBorders>
+              <w:bottom w:val="single" w:sz="4" w:space="0" w:color="auto"/>
+            </w:tcBorders>
+          </w:tcPr>
+          <w:p>
+            <w:pPr>
+              <w:rPr>
+                <w:rFonts w:ascii="Cambria" w:hAnsi="Cambria"/>
+              </w:rPr>
+            </w:pPr>
+            <w:r>
+              <w:rPr>
+                <w:rFonts w:ascii="Cambria" w:hAnsi="Cambria"/>
+              </w:rPr>
+              <w:t>Numeric / Categorical</w:t>
+            </w:r>
+          </w:p>
+          <w:p>
+            <w:pPr>
+              <w:rPr>
+                <w:rFonts w:ascii="Cambria" w:hAnsi="Cambria"/>
+              </w:rPr>
+            </w:pPr>
+          </w:p>
+        </w:tc>
+      </w:tr>
+      <w:tr>
+        <w:tc>
+          <w:tcPr>
+            <w:tcW w:w="1714" w:type="dxa"/>
+            <w:shd w:val="clear" w:color="auto" w:fill="D9D9D9" w:themeFill="background1" w:themeFillShade="D9"/>
+          </w:tcPr>
+          <w:p>
+            <w:pPr>
+              <w:rPr>
+                <w:rFonts w:ascii="Cambria" w:hAnsi="Cambria"/>
+              </w:rPr>
+            </w:pPr>
+            <w:r>
+              <w:rPr>
+                <w:rFonts w:ascii="Cambria" w:hAnsi="Cambria"/>
+              </w:rPr>
+              <w:t>Anesthesia timing</w:t>
+            </w:r>
+          </w:p>
+        </w:tc>
+        <w:tc>
+          <w:tcPr>
+            <w:tcW w:w="1560" w:type="dxa"/>
+            <w:shd w:val="clear" w:color="auto" w:fill="D9D9D9" w:themeFill="background1" w:themeFillShade="D9"/>
+          </w:tcPr>
+          <w:p>
+            <w:pPr>
+              <w:rPr>
+                <w:rFonts w:ascii="Cambria" w:hAnsi="Cambria"/>
+              </w:rPr>
+            </w:pPr>
+            <w:r>
+              <w:rPr>
+                <w:rFonts w:ascii="Cambria" w:hAnsi="Cambria"/>
+                <w:color w:val="000000" w:themeColor="text1"/>
+              </w:rPr>
+              <w:t>Patient Procedure Events</w:t>
+            </w:r>
+          </w:p>
+        </w:tc>
+        <w:tc>
+          <w:tcPr>
+            <w:tcW w:w="1541" w:type="dxa"/>
+            <w:shd w:val="clear" w:color="auto" w:fill="D9D9D9" w:themeFill="background1" w:themeFillShade="D9"/>
+          </w:tcPr>
+          <w:p>
+            <w:pPr>
+              <w:rPr>
+                <w:rFonts w:ascii="Cambria" w:hAnsi="Cambria"/>
+              </w:rPr>
+            </w:pPr>
+            <w:r>
+              <w:rPr>
+                <w:rFonts w:ascii="Cambria" w:hAnsi="Cambria"/>
+              </w:rPr>
+              <w:t>EVENT_DISPLAY_NAME, EVENT_TIME</w:t>
+            </w:r>
+          </w:p>
+        </w:tc>
+        <w:tc>
+          <w:tcPr>
+            <w:tcW w:w="1579" w:type="dxa"/>
+            <w:shd w:val="clear" w:color="auto" w:fill="D9D9D9" w:themeFill="background1" w:themeFillShade="D9"/>
+          </w:tcPr>
+          <w:p>
+            <w:pPr>
+              <w:rPr>
+                <w:rFonts w:ascii="Cambria" w:hAnsi="Cambria"/>
+              </w:rPr>
+            </w:pPr>
+            <w:r>
+              <w:rPr>
+                <w:rFonts w:ascii="Cambria" w:hAnsi="Cambria"/>
+              </w:rPr>
+              <w:t>anesthesia_start (alignment only)</w:t>
+            </w:r>
+          </w:p>
+        </w:tc>
+        <w:tc>
+          <w:tcPr>
+            <w:tcW w:w="1271" w:type="dxa"/>
+            <w:shd w:val="clear" w:color="auto" w:fill="D9D9D9" w:themeFill="background1" w:themeFillShade="D9"/>
+          </w:tcPr>
+          <w:p>
+            <w:pPr>
+              <w:rPr>
+                <w:rFonts w:ascii="Cambria" w:hAnsi="Cambria"/>
+              </w:rPr>
+            </w:pPr>
+            <w:r>
+              <w:rPr>
+                <w:rFonts w:ascii="Cambria" w:hAnsi="Cambria"/>
+              </w:rPr>
+              <w:t>Encounter-event record</w:t>
+            </w:r>
+          </w:p>
+        </w:tc>
+        <w:tc>
+          <w:tcPr>
+            <w:tcW w:w="1351" w:type="dxa"/>
+            <w:shd w:val="clear" w:color="auto" w:fill="D9D9D9" w:themeFill="background1" w:themeFillShade="D9"/>
+          </w:tcPr>
+          <w:p>
+            <w:pPr>
+              <w:rPr>
+                <w:rFonts w:ascii="Cambria" w:hAnsi="Cambria"/>
+              </w:rPr>
+            </w:pPr>
+            <w:r>
+              <w:rPr>
+                <w:rFonts w:ascii="Cambria" w:hAnsi="Cambria"/>
+              </w:rPr>
+              <w:t>Datetime</w:t>
+            </w:r>
+          </w:p>
+        </w:tc>
+      </w:tr>
+    </w:tbl>
     <w:p>
       <w:pPr>
         <w:rPr>
@@ -828,7 +1889,26 @@
         <w:rPr>
           <w:rFonts w:ascii="Cambria" w:hAnsi="Cambria"/>
         </w:rPr>
-        <w:lastRenderedPageBreak/>
+        <w:t>Table 1 Version 2</w:t>
+      </w:r>
+    </w:p>
+    <w:p>
+      <w:pPr>
+        <w:rPr>
+          <w:rFonts w:ascii="Cambria" w:hAnsi="Cambria"/>
+        </w:rPr>
+      </w:pPr>
+    </w:p>
+    <w:p>
+      <w:pPr>
+        <w:rPr>
+          <w:rFonts w:ascii="Cambria" w:hAnsi="Cambria"/>
+        </w:rPr>
+      </w:pPr>
+      <w:r>
+        <w:rPr>
+          <w:rFonts w:ascii="Cambria" w:hAnsi="Cambria"/>
+        </w:rPr>
         <w:t>Together, these mapped fields support constructing an encounter-level dataset indexed by LOG_ID, containing the hypoxemia outcome, demographics (age/sex/BMI)</w:t>
       </w:r>
       <w:r>
@@ -850,7 +1930,94 @@
         <w:t>.</w:t>
       </w:r>
     </w:p>
-    <w:p/>
+    <w:p>
+      <w:pPr>
+        <w:rPr>
+          <w:rFonts w:ascii="Cambria" w:hAnsi="Cambria"/>
+        </w:rPr>
+      </w:pPr>
+    </w:p>
+    <w:p>
+      <w:pPr>
+        <w:rPr>
+          <w:rFonts w:ascii="Cambria" w:hAnsi="Cambria"/>
+          <w:b/>
+          <w:bCs/>
+          <w:sz w:val="24"/>
+        </w:rPr>
+      </w:pPr>
+      <w:r>
+        <w:rPr>
+          <w:rFonts w:ascii="Cambria" w:hAnsi="Cambria"/>
+          <w:b/>
+          <w:bCs/>
+          <w:sz w:val="24"/>
+        </w:rPr>
+        <w:t>References</w:t>
+      </w:r>
+    </w:p>
+    <w:p>
+      <w:pPr>
+        <w:ind w:left="312" w:hanging="312"/>
+        <w:rPr>
+          <w:rFonts w:ascii="Cambria" w:hAnsi="Cambria"/>
+        </w:rPr>
+      </w:pPr>
+      <w:r>
+        <w:rPr>
+          <w:rFonts w:ascii="Cambria" w:hAnsi="Cambria"/>
+        </w:rPr>
+        <w:t xml:space="preserve">[7] </w:t>
+      </w:r>
+      <w:r>
+        <w:rPr>
+          <w:rFonts w:ascii="Cambria" w:hAnsi="Cambria"/>
+        </w:rPr>
+        <w:t xml:space="preserve">Muntaha Samad, Mirana Angel, Joseph Rinehart, Yuzo </w:t>
+      </w:r>
+      <w:proofErr w:type="spellStart"/>
+      <w:r>
+        <w:rPr>
+          <w:rFonts w:ascii="Cambria" w:hAnsi="Cambria"/>
+        </w:rPr>
+        <w:t>Kanomata</w:t>
+      </w:r>
+      <w:proofErr w:type="spellEnd"/>
+      <w:r>
+        <w:rPr>
+          <w:rFonts w:ascii="Cambria" w:hAnsi="Cambria"/>
+        </w:rPr>
+        <w:t xml:space="preserve">, Pierre Baldi, and Maxime </w:t>
+      </w:r>
+      <w:proofErr w:type="spellStart"/>
+      <w:r>
+        <w:rPr>
+          <w:rFonts w:ascii="Cambria" w:hAnsi="Cambria"/>
+        </w:rPr>
+        <w:t>Cannesson</w:t>
+      </w:r>
+      <w:proofErr w:type="spellEnd"/>
+      <w:r>
+        <w:rPr>
+          <w:rFonts w:ascii="Cambria" w:hAnsi="Cambria"/>
+        </w:rPr>
+        <w:t xml:space="preserve">. 2023. Medical Informatics Operating Room Vitals and Events Repository (MOVER): a public-access operating room database. </w:t>
+      </w:r>
+      <w:r>
+        <w:rPr>
+          <w:rFonts w:ascii="Cambria" w:hAnsi="Cambria"/>
+          <w:i/>
+          <w:iCs/>
+        </w:rPr>
+        <w:t>JAMIA Open</w:t>
+      </w:r>
+      <w:r>
+        <w:rPr>
+          <w:rFonts w:ascii="Cambria" w:hAnsi="Cambria"/>
+        </w:rPr>
+        <w:t xml:space="preserve"> 6, 4 (2023), ooad084. https://doi.org/10.1093/jamiaopen/ooad084</w:t>
+      </w:r>
+    </w:p>
     <w:sectPr>
       <w:pgSz w:w="11906" w:h="16838"/>
       <w:pgMar w:top="1440" w:right="1440" w:bottom="1440" w:left="1440" w:header="851" w:footer="992" w:gutter="0"/>
@@ -1281,7 +2448,7 @@
     <w:pPr>
       <w:keepNext/>
       <w:keepLines/>
-      <w:spacing w:before="480" w:after="80" w:line="278" w:lineRule="auto"/>
+      <w:spacing w:before="480" w:after="80"/>
       <w:outlineLvl w:val="0"/>
     </w:pPr>
     <w:rPr>
@@ -1304,7 +2471,7 @@
     <w:pPr>
       <w:keepNext/>
       <w:keepLines/>
-      <w:spacing w:before="160" w:after="80" w:line="278" w:lineRule="auto"/>
+      <w:spacing w:before="160" w:after="80"/>
       <w:outlineLvl w:val="1"/>
     </w:pPr>
     <w:rPr>
@@ -1327,7 +2494,7 @@
     <w:pPr>
       <w:keepNext/>
       <w:keepLines/>
-      <w:spacing w:before="160" w:after="80" w:line="278" w:lineRule="auto"/>
+      <w:spacing w:before="160" w:after="80"/>
       <w:outlineLvl w:val="2"/>
     </w:pPr>
     <w:rPr>
@@ -1350,7 +2517,7 @@
     <w:pPr>
       <w:keepNext/>
       <w:keepLines/>
-      <w:spacing w:before="80" w:after="40" w:line="278" w:lineRule="auto"/>
+      <w:spacing w:before="80" w:after="40"/>
       <w:outlineLvl w:val="3"/>
     </w:pPr>
     <w:rPr>
@@ -1373,7 +2540,7 @@
     <w:pPr>
       <w:keepNext/>
       <w:keepLines/>
-      <w:spacing w:before="80" w:after="40" w:line="278" w:lineRule="auto"/>
+      <w:spacing w:before="80" w:after="40"/>
       <w:outlineLvl w:val="4"/>
     </w:pPr>
     <w:rPr>
@@ -1395,7 +2562,7 @@
     <w:pPr>
       <w:keepNext/>
       <w:keepLines/>
-      <w:spacing w:before="40" w:line="278" w:lineRule="auto"/>
+      <w:spacing w:before="40"/>
       <w:outlineLvl w:val="5"/>
     </w:pPr>
     <w:rPr>
@@ -1418,7 +2585,7 @@
     <w:pPr>
       <w:keepNext/>
       <w:keepLines/>
-      <w:spacing w:before="40" w:line="278" w:lineRule="auto"/>
+      <w:spacing w:before="40"/>
       <w:outlineLvl w:val="6"/>
     </w:pPr>
     <w:rPr>
@@ -1441,7 +2608,6 @@
     <w:pPr>
       <w:keepNext/>
       <w:keepLines/>
-      <w:spacing w:line="278" w:lineRule="auto"/>
       <w:outlineLvl w:val="7"/>
     </w:pPr>
     <w:rPr>
@@ -1462,7 +2628,6 @@
     <w:pPr>
       <w:keepNext/>
       <w:keepLines/>
-      <w:spacing w:line="278" w:lineRule="auto"/>
       <w:outlineLvl w:val="8"/>
     </w:pPr>
     <w:rPr>
@@ -1674,7 +2839,6 @@
       <w:numPr>
         <w:ilvl w:val="1"/>
       </w:numPr>
-      <w:spacing w:after="160" w:line="278" w:lineRule="auto"/>
       <w:jc w:val="center"/>
     </w:pPr>
     <w:rPr>
@@ -1709,7 +2873,7 @@
     <w:qFormat/>
     <w:rsid w:val="00C0108E"/>
     <w:pPr>
-      <w:spacing w:before="160" w:after="160" w:line="278" w:lineRule="auto"/>
+      <w:spacing w:before="160"/>
       <w:jc w:val="center"/>
     </w:pPr>
     <w:rPr>
@@ -1738,7 +2902,6 @@
     <w:qFormat/>
     <w:rsid w:val="00C0108E"/>
     <w:pPr>
-      <w:spacing w:after="160" w:line="278" w:lineRule="auto"/>
       <w:ind w:left="720"/>
       <w:contextualSpacing/>
     </w:pPr>
@@ -1768,7 +2931,7 @@
         <w:top w:val="single" w:sz="4" w:space="10" w:color="0F4761" w:themeColor="accent1" w:themeShade="BF"/>
         <w:bottom w:val="single" w:sz="4" w:space="10" w:color="0F4761" w:themeColor="accent1" w:themeShade="BF"/>
       </w:pBdr>
-      <w:spacing w:before="360" w:after="360" w:line="278" w:lineRule="auto"/>
+      <w:spacing w:before="360" w:after="360"/>
       <w:ind w:left="864" w:right="864"/>
       <w:jc w:val="center"/>
     </w:pPr>

</xml_diff>